<commit_message>
Guiones profes v3: 3 videos = 3 semanas en el orden que quieran; equipo (mic+telefono) se pide a Jacqueline; aclarado profe solo a camara
Co-Authored-By: Claude Fable 5 <noreply@anthropic.com>
</commit_message>
<xml_diff>
--- a/recursos/comercial/campañas/guiones_profes/GUION_JuanDiego.docx
+++ b/recursos/comercial/campañas/guiones_profes/GUION_JuanDiego.docx
@@ -25,7 +25,20 @@
           <w:color w:val="8A7A6A"/>
           <w:sz w:val="20"/>
         </w:rPr>
-        <w:t>Aquí tienes TRES opciones. Escoge UNA — la que te dé menos susto. Con una cumples la semana; si te animas a más, mejor.</w:t>
+        <w:t>Estos son TUS TRES VIDEOS de las próximas 3 semanas: UNO por semana, en el orden que tú quieras (empieza por el que te dé menos susto).</w:t>
+      </w:r>
+    </w:p>
+    <w:p>
+      <w:pPr>
+        <w:jc w:val="center"/>
+      </w:pPr>
+      <w:r>
+        <w:rPr>
+          <w:b/>
+          <w:color w:val="33261A"/>
+          <w:sz w:val="20"/>
+        </w:rPr>
+        <w:t>Los grabas TÚ SOLO a cámara — sin alumnos, sin coordinar con nadie. El micrófono y el teléfono se los pides a Jacqueline.</w:t>
       </w:r>
     </w:p>
     <w:p>
@@ -45,7 +58,37 @@
           <w:i w:val="0"/>
           <w:sz w:val="20"/>
         </w:rPr>
-        <w:t>Vertical (9:16) · celular a la altura de los ojos · luz de frente · pega el guion en una app de teleprompter (BIGVU, gratis) y léelo — no hay que memorizar · lo que está en inglés se dice DESPACIO y claro · máximo 2 tomas · manda el crudo por WhatsApp a Diana, sin editar. Lo de [corchetes] no se dice.</w:t>
+        <w:t>1. Pídele a Jacqueline el TELÉFONO y el MICRÓFONO de grabación (están en la academia para esto).</w:t>
+      </w:r>
+    </w:p>
+    <w:p>
+      <w:r>
+        <w:rPr>
+          <w:b w:val="0"/>
+          <w:i w:val="0"/>
+          <w:sz w:val="20"/>
+        </w:rPr>
+        <w:t>2. Vertical (9:16) · teléfono a la altura de los ojos · luz de frente (una ventana sirve) · en el salón o donde haya silencio.</w:t>
+      </w:r>
+    </w:p>
+    <w:p>
+      <w:r>
+        <w:rPr>
+          <w:b w:val="0"/>
+          <w:i w:val="0"/>
+          <w:sz w:val="20"/>
+        </w:rPr>
+        <w:t>3. Pega el guion en una app de teleprompter (BIGVU, gratis) y léelo — no hay que memorizar. Lo que está en inglés se dice DESPACIO y claro.</w:t>
+      </w:r>
+    </w:p>
+    <w:p>
+      <w:r>
+        <w:rPr>
+          <w:b w:val="0"/>
+          <w:i w:val="0"/>
+          <w:sz w:val="20"/>
+        </w:rPr>
+        <w:t>4. Máximo 2 tomas. Manda el crudo por WhatsApp a Diana, sin editar. Lo de [corchetes] no se dice.</w:t>
       </w:r>
     </w:p>
     <w:p>
@@ -55,7 +98,7 @@
           <w:color w:val="E54C09"/>
           <w:sz w:val="24"/>
         </w:rPr>
-        <w:t>OPCIÓN A — “Ese pues te delata” (30 seg · la más potente)</w:t>
+        <w:t>VIDEO 1 — “Ese pues te delata” (30 seg · el más potente)</w:t>
       </w:r>
     </w:p>
     <w:p>
@@ -126,7 +169,7 @@
           <w:color w:val="E54C09"/>
           <w:sz w:val="24"/>
         </w:rPr>
-        <w:t>OPCIÓN B — El error real de clase (20 seg · más corta)</w:t>
+        <w:t>VIDEO 2 — El error real de clase (20 seg · más corto)</w:t>
       </w:r>
     </w:p>
     <w:p>
@@ -187,7 +230,7 @@
           <w:color w:val="1E6E42"/>
           <w:sz w:val="24"/>
         </w:rPr>
-        <w:t>OPCIÓN C — La Frase del Día (15 seg · la más fácil)</w:t>
+        <w:t>VIDEO 3 — La Frase del Día (15 seg · el más fácil)</w:t>
       </w:r>
     </w:p>
     <w:p>
@@ -248,7 +291,7 @@
           <w:i w:val="0"/>
           <w:sz w:val="20"/>
         </w:rPr>
-        <w:t>El texto en pantalla lo pone el editor — tú solo graba y manda. Gracias por hacer parte: tu cara es la de la academia.</w:t>
+        <w:t>Uno por semana: al mandar los 3 quedaste al día del mes. El texto en pantalla lo pone el editor — tú solo grabas y mandas. Gracias por hacer parte: tu cara es la de la academia.</w:t>
       </w:r>
     </w:p>
     <w:sectPr>

</xml_diff>